<commit_message>
User guide (EN): Retention - Step 6 charts side by side (job-title chart re-captured at half width)
Co-Authored-By: Claude Sonnet 5.5 <noreply@anthropic.com>
Claude-Session: https://claude.ai/code/session_019dELNUNjVMr3Ja2mUwBrCu
</commit_message>
<xml_diff>
--- a/docs/user-guide/en/pages/08-retention.docx
+++ b/docs/user-guide/en/pages/08-retention.docx
@@ -1203,6 +1203,20 @@
               </w:drawing>
             </w:r>
           </w:p>
+          <w:p>
+            <w:pPr>
+              <w:spacing w:after="70" w:line="270"/>
+            </w:pPr>
+            <w:r>
+              <w:rPr>
+                <w:rFonts w:ascii="Arial" w:cs="Arial" w:eastAsia="Arial" w:hAnsi="Arial"/>
+                <w:color w:val="27251F"/>
+                <w:sz w:val="21"/>
+                <w:szCs w:val="21"/>
+              </w:rPr>
+              <w:t xml:space="preserve">Share of the current team with 6+ months on the job, split by gender.</w:t>
+            </w:r>
+          </w:p>
         </w:tc>
         <w:tc>
           <w:tcPr>
@@ -1222,6 +1236,53 @@
           </w:tcPr>
           <w:p>
             <w:pPr>
+              <w:keepNext/>
+              <w:spacing w:after="120" w:before="60"/>
+              <w:jc w:val="center"/>
+            </w:pPr>
+            <w:r>
+              <w:drawing>
+                <wp:inline distT="0" distB="0" distL="0" distR="0">
+                  <wp:extent cx="3286125" cy="2343150"/>
+                  <wp:effectExtent t="0" r="0" b="0" l="0"/>
+                  <wp:docPr id="1" name="" descr="" title=""/>
+                  <wp:cNvGraphicFramePr>
+                    <a:graphicFrameLocks xmlns:a="http://schemas.openxmlformats.org/drawingml/2006/main" noChangeAspect="1"/>
+                  </wp:cNvGraphicFramePr>
+                  <a:graphic xmlns:a="http://schemas.openxmlformats.org/drawingml/2006/main">
+                    <a:graphicData uri="http://schemas.openxmlformats.org/drawingml/2006/picture">
+                      <pic:pic xmlns:pic="http://schemas.openxmlformats.org/drawingml/2006/picture">
+                        <pic:nvPicPr>
+                          <pic:cNvPr id="0" name="" descr=""/>
+                          <pic:cNvPicPr>
+                            <a:picLocks noChangeAspect="1" noChangeArrowheads="1"/>
+                          </pic:cNvPicPr>
+                        </pic:nvPicPr>
+                        <pic:blipFill>
+                          <a:blip r:embed="rId22" cstate="none"/>
+                          <a:srcRect/>
+                          <a:stretch>
+                            <a:fillRect/>
+                          </a:stretch>
+                        </pic:blipFill>
+                        <pic:spPr bwMode="auto">
+                          <a:xfrm>
+                            <a:off x="0" y="0"/>
+                            <a:ext cx="3286125" cy="2343150"/>
+                          </a:xfrm>
+                          <a:prstGeom prst="rect">
+                            <a:avLst/>
+                          </a:prstGeom>
+                        </pic:spPr>
+                      </pic:pic>
+                    </a:graphicData>
+                  </a:graphic>
+                </wp:inline>
+              </w:drawing>
+            </w:r>
+          </w:p>
+          <w:p>
+            <w:pPr>
               <w:spacing w:after="70" w:line="270"/>
             </w:pPr>
             <w:r>
@@ -1231,7 +1292,7 @@
                 <w:sz w:val="21"/>
                 <w:szCs w:val="21"/>
               </w:rPr>
-              <w:t xml:space="preserve">Share of the current team with 6+ months on the job, split by gender.</w:t>
+              <w:t xml:space="preserve">Share of each job title's current team that has been on the job 6+ months.</w:t>
             </w:r>
           </w:p>
         </w:tc>
@@ -1249,67 +1310,6 @@
           <w:szCs w:val="21"/>
         </w:rPr>
         <w:t xml:space="preserve"/>
-      </w:r>
-    </w:p>
-    <w:p>
-      <w:pPr>
-        <w:keepNext/>
-        <w:spacing w:after="120" w:before="60"/>
-        <w:jc w:val="center"/>
-      </w:pPr>
-      <w:r>
-        <w:drawing>
-          <wp:inline distT="0" distB="0" distL="0" distR="0">
-            <wp:extent cx="6953250" cy="1962150"/>
-            <wp:effectExtent t="0" r="0" b="0" l="0"/>
-            <wp:docPr id="1" name="" descr="" title=""/>
-            <wp:cNvGraphicFramePr>
-              <a:graphicFrameLocks xmlns:a="http://schemas.openxmlformats.org/drawingml/2006/main" noChangeAspect="1"/>
-            </wp:cNvGraphicFramePr>
-            <a:graphic xmlns:a="http://schemas.openxmlformats.org/drawingml/2006/main">
-              <a:graphicData uri="http://schemas.openxmlformats.org/drawingml/2006/picture">
-                <pic:pic xmlns:pic="http://schemas.openxmlformats.org/drawingml/2006/picture">
-                  <pic:nvPicPr>
-                    <pic:cNvPr id="0" name="" descr=""/>
-                    <pic:cNvPicPr>
-                      <a:picLocks noChangeAspect="1" noChangeArrowheads="1"/>
-                    </pic:cNvPicPr>
-                  </pic:nvPicPr>
-                  <pic:blipFill>
-                    <a:blip r:embed="rId22" cstate="none"/>
-                    <a:srcRect/>
-                    <a:stretch>
-                      <a:fillRect/>
-                    </a:stretch>
-                  </pic:blipFill>
-                  <pic:spPr bwMode="auto">
-                    <a:xfrm>
-                      <a:off x="0" y="0"/>
-                      <a:ext cx="6953250" cy="1962150"/>
-                    </a:xfrm>
-                    <a:prstGeom prst="rect">
-                      <a:avLst/>
-                    </a:prstGeom>
-                  </pic:spPr>
-                </pic:pic>
-              </a:graphicData>
-            </a:graphic>
-          </wp:inline>
-        </w:drawing>
-      </w:r>
-    </w:p>
-    <w:p>
-      <w:pPr>
-        <w:spacing w:after="70" w:line="270"/>
-      </w:pPr>
-      <w:r>
-        <w:rPr>
-          <w:rFonts w:ascii="Arial" w:cs="Arial" w:eastAsia="Arial" w:hAnsi="Arial"/>
-          <w:color w:val="27251F"/>
-          <w:sz w:val="21"/>
-          <w:szCs w:val="21"/>
-        </w:rPr>
-        <w:t xml:space="preserve">Share of each job title's current team that has been on the job 6+ months.</w:t>
       </w:r>
     </w:p>
     <w:p>

</xml_diff>